<commit_message>
resume: short summary plus AI Copilot detail bullet in v2
</commit_message>
<xml_diff>
--- a/resume/resume-v2.docx
+++ b/resume/resume-v2.docx
@@ -549,7 +549,7 @@
           <w:color w:val="19232D"/>
           <w:sz w:val="20"/>
         </w:rPr>
-        <w:t>概述：本人负责视觉算法与 AI Copilot 开发，桌面端作为 Copilot 的工作台；在线演示 kexin.uno/demo。</w:t>
+        <w:t>概述：本人负责视觉算法与 AI Copilot 开发；在线演示 kexin.uno/demo。</w:t>
       </w:r>
     </w:p>
     <w:p>
@@ -597,6 +597,31 @@
       </w:r>
       <w:r>
         <w:t>实现 OK/NG/UNKNOWN 三态 Fail‑Safe 决策，任一路数据异常降级为 UNKNOWN，避免误放行；判定阈值支持配置热更新，配套离线批量回归工具保证同图同结论，系统已产线商用运行。</w:t>
+      </w:r>
+    </w:p>
+    <w:p>
+      <w:pPr>
+        <w:spacing w:before="0" w:after="40" w:line="276" w:lineRule="auto"/>
+        <w:ind w:left="320" w:hanging="320"/>
+        <w:rPr>
+          <w:rFonts w:hint="eastAsia"/>
+          <w:lang w:eastAsia="zh-CN"/>
+        </w:rPr>
+      </w:pPr>
+      <w:r>
+        <w:t>•</w:t>
+      </w:r>
+      <w:r>
+        <w:tab/>
+      </w:r>
+      <w:r>
+        <w:rPr>
+          <w:b/>
+        </w:rPr>
+        <w:t>AI Copilot 层：</w:t>
+      </w:r>
+      <w:r>
+        <w:t>在不改相机 / 算法 / PLC 的前提下叠加 Agent + RAG 应用层，16 个工具覆盖单袋查询、批量筛选、原因分布与知识检索；混合检索带引用、证据不足明确拒答；132 条工具回归与 288 例视觉标注完成评测闭环，端到端从 19.5 s 降到 3–5 s</w:t>
       </w:r>
     </w:p>
     <w:p>

</xml_diff>

<commit_message>
resume: revert v2 to algorithm-focused version
</commit_message>
<xml_diff>
--- a/resume/resume-v2.docx
+++ b/resume/resume-v2.docx
@@ -549,7 +549,7 @@
           <w:color w:val="19232D"/>
           <w:sz w:val="20"/>
         </w:rPr>
-        <w:t>概述：本人负责视觉算法与 AI Copilot 开发；在线演示 kexin.uno/demo。</w:t>
+        <w:t>概述：本人负责视觉算法与 AI Copilot 开发，桌面端作为 Copilot 的工作台；在线演示 kexin.uno/demo。</w:t>
       </w:r>
     </w:p>
     <w:p>
@@ -597,31 +597,6 @@
       </w:r>
       <w:r>
         <w:t>实现 OK/NG/UNKNOWN 三态 Fail‑Safe 决策，任一路数据异常降级为 UNKNOWN，避免误放行；判定阈值支持配置热更新，配套离线批量回归工具保证同图同结论，系统已产线商用运行。</w:t>
-      </w:r>
-    </w:p>
-    <w:p>
-      <w:pPr>
-        <w:spacing w:before="0" w:after="40" w:line="276" w:lineRule="auto"/>
-        <w:ind w:left="320" w:hanging="320"/>
-        <w:rPr>
-          <w:rFonts w:hint="eastAsia"/>
-          <w:lang w:eastAsia="zh-CN"/>
-        </w:rPr>
-      </w:pPr>
-      <w:r>
-        <w:t>•</w:t>
-      </w:r>
-      <w:r>
-        <w:tab/>
-      </w:r>
-      <w:r>
-        <w:rPr>
-          <w:b/>
-        </w:rPr>
-        <w:t>AI Copilot 层：</w:t>
-      </w:r>
-      <w:r>
-        <w:t>在不改相机 / 算法 / PLC 的前提下叠加 Agent + RAG 应用层，16 个工具覆盖单袋查询、批量筛选、原因分布与知识检索；混合检索带引用、证据不足明确拒答；132 条工具回归与 288 例视觉标注完成评测闭环，端到端从 19.5 s 降到 3–5 s</w:t>
       </w:r>
     </w:p>
     <w:p>

</xml_diff>

<commit_message>
resume: one-line overview, details as bullets (v2)
</commit_message>
<xml_diff>
--- a/resume/resume-v2.docx
+++ b/resume/resume-v2.docx
@@ -432,7 +432,7 @@
           <w:szCs w:val="21"/>
           <w:shd w:val="clear" w:fill="FFFFFF"/>
         </w:rPr>
-        <w:t>基于 YOLOv8-seg 实现烟标表面缺陷分割检测，针对烟标纹理复杂、光照多变场景做数据集增强与模型调优；完成模型量化、ONNX 导出，基于 C++ NAPI + ONNXRuntime 在鸿蒙设备端完成推理移植，实现端侧离线检测。</w:t>
+        <w:t>基于 YOLOv8-seg 的烟标表面缺陷分割检测，端侧离线推理，已通过真机一致性验收。</w:t>
       </w:r>
     </w:p>
     <w:p>
@@ -486,7 +486,13 @@
         <w:tab/>
       </w:r>
       <w:r>
-        <w:t>将烟标缺陷检测算法迁移至 HarmonyOS 移动端，完成 YOLOv8 模型导出与端侧推理链路。负责 C++ NAPI 模块开发，打通模型在鸿蒙设备上的调用；构建拍摄‑预处理‑推理‑置信度过滤‑本地落库‑可靠上传完整端侧 AI 链路。</w:t>
+        <w:rPr>
+          <w:b/>
+        </w:rPr>
+        <w:t>模型与数据：</w:t>
+      </w:r>
+      <w:r>
+        <w:t>针对烟标纹理复杂、光照多变做数据集增强与模型调优；完成模型量化与 ONNX 导出，基于 C++ NAPI + ONNXRuntime 在鸿蒙设备完成推理移植</w:t>
       </w:r>
     </w:p>
     <w:p>
@@ -504,7 +510,61 @@
         <w:tab/>
       </w:r>
       <w:r>
-        <w:t>设计上传状态机，实现失败退避重试、重复上传幂等去重；建立真机一致性判据开展验收，覆盖文字行、图标、烫金套印、脏点四类缺陷。使用 TaskPool 执行异步推理避免 UI 阻塞，检测历史与样本库通过 RDB 持久化存储。</w:t>
+        <w:rPr>
+          <w:b/>
+        </w:rPr>
+        <w:t>端侧链路：</w:t>
+      </w:r>
+      <w:r>
+        <w:t>构建「拍摄 → 预处理 → 推理 → 置信度过滤 → 本地落库 → 可靠上传」完整链路；TaskPool 异步推理避免 UI 阻塞</w:t>
+      </w:r>
+    </w:p>
+    <w:p>
+      <w:pPr>
+        <w:spacing w:before="0" w:after="40" w:line="276" w:lineRule="auto"/>
+        <w:ind w:left="320" w:hanging="320"/>
+        <w:rPr>
+          <w:rFonts w:hint="default"/>
+        </w:rPr>
+      </w:pPr>
+      <w:r>
+        <w:t>•</w:t>
+      </w:r>
+      <w:r>
+        <w:tab/>
+      </w:r>
+      <w:r>
+        <w:rPr>
+          <w:b/>
+        </w:rPr>
+        <w:t>上传与存储：</w:t>
+      </w:r>
+      <w:r>
+        <w:t>设计上传状态机，失败退避重试、重复上传幂等去重；检测历史与样本库通过 HarmonyOS RDB 持久化</w:t>
+      </w:r>
+    </w:p>
+    <w:p>
+      <w:pPr>
+        <w:spacing w:before="0" w:after="40" w:line="276" w:lineRule="auto"/>
+        <w:ind w:left="320" w:hanging="320"/>
+        <w:rPr>
+          <w:rFonts w:hint="default"/>
+        </w:rPr>
+      </w:pPr>
+      <w:r>
+        <w:t>•</w:t>
+      </w:r>
+      <w:r>
+        <w:tab/>
+      </w:r>
+      <w:r>
+        <w:rPr>
+          <w:b/>
+        </w:rPr>
+        <w:t>验收：</w:t>
+      </w:r>
+      <w:r>
+        <w:t>建立真机一致性判据开展验收，覆盖文字行、图标、烫金套印、脏点四类缺陷</w:t>
       </w:r>
     </w:p>
     <w:p>
@@ -535,7 +595,7 @@
           <w:color w:val="19232D"/>
           <w:sz w:val="20"/>
         </w:rPr>
-        <w:t>红外热成像 + 可见光双相机产线封口质检系统，由 PLC 硬触发完成双相机同帧采集、纳秒级时间戳配对。可见光侧通过动态规划求取最优边缘，RANSAC 拟合基准线，设置内点率、覆盖率、残差、倾角四重质量门完成缺陷判定；红外侧实现自适应温度分割、逐列几何量测、基于 MAD 的稳健异物检测。</w:t>
+        <w:t>红外热成像 + 可见光双相机的产线封口质量在线判别系统，PLC 硬触发同帧采集，已商用上线。</w:t>
       </w:r>
     </w:p>
     <w:p>
@@ -596,7 +656,88 @@
         <w:tab/>
       </w:r>
       <w:r>
-        <w:t>实现 OK/NG/UNKNOWN 三态 Fail‑Safe 决策，任一路数据异常降级为 UNKNOWN，避免误放行；判定阈值支持配置热更新，配套离线批量回归工具保证同图同结论，系统已产线商用运行。</w:t>
+        <w:rPr>
+          <w:b/>
+        </w:rPr>
+        <w:t>双相机同步：</w:t>
+      </w:r>
+      <w:r>
+        <w:t>PLC 硬触发完成双相机同帧采集、纳秒级时间戳配对，避免两路时间错位导致的误判</w:t>
+      </w:r>
+    </w:p>
+    <w:p>
+      <w:pPr>
+        <w:spacing w:before="0" w:after="40" w:line="276" w:lineRule="auto"/>
+        <w:ind w:left="320" w:hanging="320"/>
+        <w:rPr>
+          <w:rFonts w:hint="eastAsia"/>
+          <w:lang w:eastAsia="zh-CN"/>
+        </w:rPr>
+      </w:pPr>
+      <w:r>
+        <w:t>•</w:t>
+      </w:r>
+      <w:r>
+        <w:tab/>
+      </w:r>
+      <w:r>
+        <w:rPr>
+          <w:b/>
+        </w:rPr>
+        <w:t>可见光算法：</w:t>
+      </w:r>
+      <w:r>
+        <w:t>动态规划求取最优边缘，RANSAC 拟合基准线，设置内点率、覆盖率、残差、倾角四重质量门完成缺陷判定</w:t>
+      </w:r>
+    </w:p>
+    <w:p>
+      <w:pPr>
+        <w:spacing w:before="0" w:after="40" w:line="276" w:lineRule="auto"/>
+        <w:ind w:left="320" w:hanging="320"/>
+        <w:rPr>
+          <w:rFonts w:hint="eastAsia"/>
+          <w:lang w:eastAsia="zh-CN"/>
+        </w:rPr>
+      </w:pPr>
+      <w:r>
+        <w:t>•</w:t>
+      </w:r>
+      <w:r>
+        <w:tab/>
+      </w:r>
+      <w:r>
+        <w:rPr>
+          <w:b/>
+        </w:rPr>
+        <w:t>红外算法：</w:t>
+      </w:r>
+      <w:r>
+        <w:t>自适应温度分割、逐列几何量测、基于 MAD 的稳健异物检测，覆盖虚封、宽度异常、倾斜与异物</w:t>
+      </w:r>
+    </w:p>
+    <w:p>
+      <w:pPr>
+        <w:spacing w:before="0" w:after="40" w:line="276" w:lineRule="auto"/>
+        <w:ind w:left="320" w:hanging="320"/>
+        <w:rPr>
+          <w:rFonts w:hint="eastAsia"/>
+          <w:lang w:eastAsia="zh-CN"/>
+        </w:rPr>
+      </w:pPr>
+      <w:r>
+        <w:t>•</w:t>
+      </w:r>
+      <w:r>
+        <w:tab/>
+      </w:r>
+      <w:r>
+        <w:rPr>
+          <w:b/>
+        </w:rPr>
+        <w:t>三态决策：</w:t>
+      </w:r>
+      <w:r>
+        <w:t>OK/NG/UNKNOWN 三态 Fail-Safe，任一路数据异常降级为 UNKNOWN 避免误放行；阈值支持配置热更新，配套离线批量回归保证同图同结论，已产线商用运行</w:t>
       </w:r>
     </w:p>
     <w:p>

</xml_diff>